<commit_message>
Protokol FVE: e-mail info@jurenkaelektro.cz, nazev elektrarny podle typu zakazky, bez zbytku cizi sablony
Co-Authored-By: Claude Opus 5.5 <noreply@anthropic.com>
</commit_message>
<xml_diff>
--- a/public/templates/protokol_fve_sablona.docx
+++ b/public/templates/protokol_fve_sablona.docx
@@ -978,7 +978,7 @@
           <w:sz w:val="20"/>
           <w:szCs w:val="20"/>
         </w:rPr>
-        <w:t xml:space="preserve">Přejímající prohlašuje, že byl řádně seznámen s povinností mít solární elektrárnu vypnutou až do doby, než mu technik distributora elektrické energie (PRE, ČEZ, EON) vymění elektroměr a vystaví protokol o připojení k distribuční soustavě. Tento protokol se zavazuje přejímající bezodkladně zaslat na e-mailovou adresu: lucie.radkeova@sefy-cr.cz.  </w:t>
+        <w:t xml:space="preserve">Přejímající prohlašuje, že byl řádně seznámen s povinností mít solární elektrárnu vypnutou až do doby, než mu technik distributora elektrické energie (PRE, ČEZ, EON) vymění elektroměr a vystaví protokol o připojení k distribuční soustavě. Tento protokol se zavazuje přejímající bezodkladně zaslat na e-mailovou adresu: info@jurenkaelektro.cz.  </w:t>
       </w:r>
     </w:p>
     <w:p>
@@ -1282,7 +1282,7 @@
           <w:b/>
           <w:szCs w:val="20"/>
         </w:rPr>
-        <w:t>SOLÁRNÍ</w:t>
+        <w:t xml:space="preserve">{elektrarna} JE</w:t>
       </w:r>
       <w:r>
         <w:rPr>
@@ -1290,7 +1290,7 @@
           <w:b/>
           <w:szCs w:val="20"/>
         </w:rPr>
-        <w:t xml:space="preserve"> ELEKTRÁRNA NA</w:t>
+        <w:t xml:space="preserve"/>
       </w:r>
       <w:r>
         <w:rPr>
@@ -1298,7 +1298,7 @@
           <w:b/>
           <w:szCs w:val="20"/>
         </w:rPr>
-        <w:t xml:space="preserve"> OHŘEV VODY</w:t>
+        <w:t xml:space="preserve"/>
       </w:r>
       <w:r>
         <w:rPr>
@@ -1306,7 +1306,7 @@
           <w:b/>
           <w:szCs w:val="20"/>
         </w:rPr>
-        <w:t xml:space="preserve"> JE PŘEDÁN</w:t>
+        <w:t xml:space="preserve"> PŘEDÁN</w:t>
       </w:r>
       <w:r>
         <w:rPr>
@@ -1338,7 +1338,7 @@
           <w:b/>
           <w:szCs w:val="20"/>
         </w:rPr>
-        <w:t xml:space="preserve">/ PŘEVZETÍ </w:t>
+        <w:t xml:space="preserve">/ PŘEVZETÍ {elektrarny} BYLO</w:t>
       </w:r>
       <w:r>
         <w:rPr>
@@ -1346,7 +1346,7 @@
           <w:b/>
           <w:szCs w:val="20"/>
         </w:rPr>
-        <w:t>SOLÁRNÍ ELEKTRÁRN</w:t>
+        <w:t xml:space="preserve"/>
       </w:r>
       <w:r>
         <w:rPr>
@@ -1354,7 +1354,7 @@
           <w:b/>
           <w:szCs w:val="20"/>
         </w:rPr>
-        <w:t>Y</w:t>
+        <w:t xml:space="preserve"/>
       </w:r>
       <w:r>
         <w:rPr>
@@ -1362,7 +1362,7 @@
           <w:b/>
           <w:szCs w:val="20"/>
         </w:rPr>
-        <w:t xml:space="preserve"> NA OHŘEV VODY </w:t>
+        <w:t xml:space="preserve"/>
       </w:r>
       <w:r>
         <w:rPr>
@@ -1370,7 +1370,7 @@
           <w:b/>
           <w:szCs w:val="20"/>
         </w:rPr>
-        <w:t>BYLO ODMÍTNUTO *</w:t>
+        <w:t xml:space="preserve"> ODMÍTNUTO *</w:t>
       </w:r>
     </w:p>
     <w:p>
@@ -5393,7 +5393,7 @@
 <file path=word/theme/theme1.xml><?xml version="1.0" encoding="utf-8"?>
 <a:theme xmlns:a="http://schemas.openxmlformats.org/drawingml/2006/main" name="Motiv Office">
   <a:themeElements>
-    <a:clrScheme name="SEFY">
+    <a:clrScheme name="Jurenka">
       <a:dk1>
         <a:sysClr val="windowText" lastClr="000000"/>
       </a:dk1>

</xml_diff>

<commit_message>
Predavaci protokol: upravitelne prohlaseni predavajiciho i prejimajiciho (okno pred vygenerovanim - vyber bodu, volby JE/NENI, vlastni text a body), vychozi vyber podle nabidky (u rozsireni FVR jen body k dodavanym komponentam), predmet predani podle typu zakazky
Co-Authored-By: Claude Opus 5.5 <noreply@anthropic.com>
</commit_message>
<xml_diff>
--- a/public/templates/protokol_fve_sablona.docx
+++ b/public/templates/protokol_fve_sablona.docx
@@ -419,7 +419,7 @@
           <w:b w:val="0"/>
           <w:bCs w:val="0"/>
         </w:rPr>
-        <w:t>Dodá</w:t>
+        <w:t>{predmetPredani}</w:t>
       </w:r>
       <w:r>
         <w:rPr>
@@ -427,7 +427,7 @@
           <w:b w:val="0"/>
           <w:bCs w:val="0"/>
         </w:rPr>
-        <w:t xml:space="preserve">vka a montáž </w:t>
+        <w:t/>
       </w:r>
       <w:r>
         <w:rPr>
@@ -435,7 +435,7 @@
           <w:b w:val="0"/>
           <w:bCs w:val="0"/>
         </w:rPr>
-        <w:t>solární elektrárny</w:t>
+        <w:t/>
       </w:r>
     </w:p>
     <w:p>
@@ -482,6 +482,22 @@
       </w:pPr>
       <w:r>
         <w:t>Prohlášení předávajícího:</w:t>
+      </w:r>
+    </w:p>
+    <w:p>
+      <w:pPr>
+        <w:pStyle w:val="Bezmezer1"/>
+        <w:rPr>
+          <w:sz w:val="20"/>
+          <w:szCs w:val="20"/>
+        </w:rPr>
+      </w:pPr>
+      <w:r>
+        <w:rPr>
+          <w:sz w:val="20"/>
+          <w:szCs w:val="20"/>
+        </w:rPr>
+        <w:t xml:space="preserve">{#prohlaseni}</w:t>
       </w:r>
     </w:p>
     <w:p>
@@ -501,7 +517,7 @@
           <w:sz w:val="20"/>
           <w:szCs w:val="20"/>
         </w:rPr>
-        <w:t xml:space="preserve">Předávající prohlašuje, že instalace solárních panelů a pokrývačské práce </w:t>
+        <w:t xml:space="preserve">{#casti}{#b}</w:t>
       </w:r>
       <w:r>
         <w:rPr>
@@ -510,364 +526,68 @@
           <w:sz w:val="20"/>
           <w:szCs w:val="20"/>
         </w:rPr>
-        <w:t>JSOU</w:t>
+        <w:t xml:space="preserve">{t}</w:t>
       </w:r>
       <w:r>
         <w:rPr>
           <w:sz w:val="20"/>
           <w:szCs w:val="20"/>
         </w:rPr>
-        <w:t xml:space="preserve"> / </w:t>
-      </w:r>
-      <w:r>
-        <w:rPr>
-          <w:b/>
-          <w:bCs/>
-          <w:sz w:val="20"/>
-          <w:szCs w:val="20"/>
-        </w:rPr>
-        <w:t>NEJSOU *</w:t>
+        <w:t xml:space="preserve">{/b}{^b}</w:t>
       </w:r>
       <w:r>
         <w:rPr>
           <w:sz w:val="20"/>
           <w:szCs w:val="20"/>
         </w:rPr>
-        <w:t xml:space="preserve"> kompletní a bez zjevných závad.</w:t>
-      </w:r>
-    </w:p>
-    <w:p>
-      <w:pPr>
-        <w:pStyle w:val="Bezmezer1"/>
-        <w:numPr>
-          <w:ilvl w:val="0"/>
-          <w:numId w:val="21"/>
-        </w:numPr>
+        <w:t xml:space="preserve">{t}</w:t>
+      </w:r>
+      <w:r>
         <w:rPr>
           <w:sz w:val="20"/>
           <w:szCs w:val="20"/>
         </w:rPr>
-      </w:pPr>
-      <w:r>
+        <w:t xml:space="preserve">{/b}{/casti}</w:t>
+      </w:r>
+    </w:p>
+    <w:p>
+      <w:pPr>
+        <w:pStyle w:val="Bezmezer1"/>
         <w:rPr>
           <w:sz w:val="20"/>
           <w:szCs w:val="20"/>
         </w:rPr>
-        <w:t>Zálohované okruhy, které byly známy v době instalace, jsou odzkoušeny a schopny provozu.</w:t>
-      </w:r>
-    </w:p>
-    <w:p>
-      <w:pPr>
-        <w:pStyle w:val="Bezmezer1"/>
-        <w:numPr>
-          <w:ilvl w:val="0"/>
-          <w:numId w:val="21"/>
-        </w:numPr>
+      </w:pPr>
+      <w:r>
         <w:rPr>
           <w:sz w:val="20"/>
           <w:szCs w:val="20"/>
         </w:rPr>
-      </w:pPr>
-      <w:r>
-        <w:rPr>
-          <w:sz w:val="20"/>
-          <w:szCs w:val="20"/>
-        </w:rPr>
-        <w:t xml:space="preserve">Předávající prohlašuje, že solární elektrárna </w:t>
-      </w:r>
-      <w:r>
-        <w:rPr>
-          <w:b/>
-          <w:bCs/>
-          <w:sz w:val="20"/>
-          <w:szCs w:val="20"/>
-        </w:rPr>
-        <w:t>JE / NENÍ *</w:t>
-      </w:r>
-      <w:r>
-        <w:rPr>
-          <w:sz w:val="20"/>
-          <w:szCs w:val="20"/>
-        </w:rPr>
-        <w:t xml:space="preserve"> připojena k lokální datové síti zákazníka pomocí </w:t>
-      </w:r>
-      <w:proofErr w:type="spellStart"/>
-      <w:r>
-        <w:rPr>
-          <w:b/>
-          <w:bCs/>
-          <w:sz w:val="20"/>
-          <w:szCs w:val="20"/>
-        </w:rPr>
-        <w:t>WiFi</w:t>
-      </w:r>
-      <w:proofErr w:type="spellEnd"/>
-      <w:r>
-        <w:rPr>
-          <w:b/>
-          <w:bCs/>
-          <w:sz w:val="20"/>
-          <w:szCs w:val="20"/>
-        </w:rPr>
-        <w:t xml:space="preserve"> / UTP *</w:t>
-      </w:r>
-      <w:r>
-        <w:rPr>
-          <w:sz w:val="20"/>
-          <w:szCs w:val="20"/>
-        </w:rPr>
-        <w:t>.</w:t>
+        <w:t xml:space="preserve">{/prohlaseni}</w:t>
       </w:r>
     </w:p>
     <w:p>
       <w:pPr>
-        <w:pStyle w:val="Bezmezer1"/>
-        <w:numPr>
-          <w:ilvl w:val="0"/>
-          <w:numId w:val="21"/>
-        </w:numPr>
-        <w:rPr>
-          <w:sz w:val="20"/>
-          <w:szCs w:val="20"/>
-        </w:rPr>
-      </w:pPr>
-      <w:r>
-        <w:rPr>
-          <w:sz w:val="20"/>
-          <w:szCs w:val="20"/>
-        </w:rPr>
-        <w:t xml:space="preserve">Předávající prohlašuje, že solární elektrárna </w:t>
-      </w:r>
-      <w:r>
-        <w:rPr>
-          <w:b/>
-          <w:bCs/>
-          <w:sz w:val="20"/>
-          <w:szCs w:val="20"/>
-        </w:rPr>
-        <w:t>JE / NENÍ *</w:t>
-      </w:r>
-      <w:r>
-        <w:rPr>
-          <w:sz w:val="20"/>
-          <w:szCs w:val="20"/>
-        </w:rPr>
-        <w:t xml:space="preserve"> řádně nainstalována, odzkoušena, dokončena a schopna provozu.</w:t>
+        <w:pStyle w:val="Nadpis2"/>
+        <w:spacing w:before="102"/>
+      </w:pPr>
+      <w:r>
+        <w:t>Prohlášení pře</w:t>
+      </w:r>
+      <w:r>
+        <w:t>jímajícího</w:t>
+      </w:r>
+      <w:r>
+        <w:t>:</w:t>
       </w:r>
     </w:p>
     <w:p>
       <w:pPr>
-        <w:pStyle w:val="Bezmezer1"/>
-        <w:numPr>
-          <w:ilvl w:val="0"/>
-          <w:numId w:val="21"/>
-        </w:numPr>
-        <w:rPr>
-          <w:sz w:val="20"/>
-          <w:szCs w:val="20"/>
-        </w:rPr>
-      </w:pPr>
-      <w:r>
-        <w:rPr>
-          <w:sz w:val="20"/>
-          <w:szCs w:val="20"/>
-        </w:rPr>
-        <w:t xml:space="preserve">V systému fotovoltaické elektrárny </w:t>
-      </w:r>
-      <w:r>
-        <w:rPr>
-          <w:b/>
-          <w:bCs/>
-          <w:sz w:val="20"/>
-          <w:szCs w:val="20"/>
-        </w:rPr>
-        <w:t>JE / NENÍ</w:t>
-      </w:r>
-      <w:r>
-        <w:rPr>
-          <w:sz w:val="20"/>
-          <w:szCs w:val="20"/>
-        </w:rPr>
-        <w:t xml:space="preserve"> </w:t>
-      </w:r>
-      <w:r>
-        <w:rPr>
-          <w:b/>
-          <w:bCs/>
-          <w:sz w:val="20"/>
-          <w:szCs w:val="20"/>
-        </w:rPr>
-        <w:t>*</w:t>
-      </w:r>
-      <w:r>
-        <w:rPr>
-          <w:sz w:val="20"/>
-          <w:szCs w:val="20"/>
-        </w:rPr>
-        <w:t xml:space="preserve"> použita jednotka </w:t>
-      </w:r>
-      <w:proofErr w:type="spellStart"/>
-      <w:r>
-        <w:rPr>
-          <w:sz w:val="20"/>
-          <w:szCs w:val="20"/>
-        </w:rPr>
-        <w:t>AZrouter</w:t>
-      </w:r>
-      <w:proofErr w:type="spellEnd"/>
-      <w:r>
-        <w:rPr>
-          <w:sz w:val="20"/>
-          <w:szCs w:val="20"/>
-        </w:rPr>
-        <w:t xml:space="preserve">. V případě použití </w:t>
-      </w:r>
-      <w:proofErr w:type="spellStart"/>
-      <w:r>
-        <w:rPr>
-          <w:sz w:val="20"/>
-          <w:szCs w:val="20"/>
-        </w:rPr>
-        <w:t>AZrouter</w:t>
-      </w:r>
-      <w:proofErr w:type="spellEnd"/>
-      <w:r>
-        <w:rPr>
-          <w:sz w:val="20"/>
-          <w:szCs w:val="20"/>
-        </w:rPr>
-        <w:t xml:space="preserve"> jednotky: </w:t>
-      </w:r>
-      <w:r>
-        <w:rPr>
-          <w:b/>
-          <w:bCs/>
-          <w:sz w:val="20"/>
-          <w:szCs w:val="20"/>
-        </w:rPr>
-        <w:t>JE</w:t>
-      </w:r>
-      <w:r>
-        <w:rPr>
-          <w:sz w:val="20"/>
-          <w:szCs w:val="20"/>
-        </w:rPr>
-        <w:t xml:space="preserve"> zapojena v měření FVE a chová se jako běžný spotřebič, může využívat energii z baterií / </w:t>
-      </w:r>
-      <w:r>
-        <w:rPr>
-          <w:b/>
-          <w:bCs/>
-          <w:sz w:val="20"/>
-          <w:szCs w:val="20"/>
-        </w:rPr>
-        <w:t>NENÍ</w:t>
-      </w:r>
-      <w:r>
-        <w:rPr>
-          <w:sz w:val="20"/>
-          <w:szCs w:val="20"/>
-        </w:rPr>
-        <w:t xml:space="preserve"> zapojena v měření a nemůže využívat energii z baterií.</w:t>
-      </w:r>
-    </w:p>
-    <w:p>
-      <w:pPr>
-        <w:pStyle w:val="Bezmezer1"/>
-        <w:numPr>
-          <w:ilvl w:val="0"/>
-          <w:numId w:val="21"/>
-        </w:numPr>
-        <w:rPr>
-          <w:sz w:val="20"/>
-          <w:szCs w:val="20"/>
-        </w:rPr>
-      </w:pPr>
-      <w:r>
-        <w:rPr>
-          <w:sz w:val="20"/>
-          <w:szCs w:val="20"/>
-        </w:rPr>
-        <w:t xml:space="preserve">V systému fotovoltaické elektrárny </w:t>
-      </w:r>
-      <w:r>
-        <w:rPr>
-          <w:b/>
-          <w:bCs/>
-          <w:sz w:val="20"/>
-          <w:szCs w:val="20"/>
-        </w:rPr>
-        <w:t>JE / NENÍ</w:t>
-      </w:r>
-      <w:r>
-        <w:rPr>
-          <w:sz w:val="20"/>
-          <w:szCs w:val="20"/>
-        </w:rPr>
-        <w:t xml:space="preserve"> </w:t>
-      </w:r>
-      <w:r>
-        <w:rPr>
-          <w:b/>
-          <w:bCs/>
-          <w:sz w:val="20"/>
-          <w:szCs w:val="20"/>
-        </w:rPr>
-        <w:t>*</w:t>
-      </w:r>
-      <w:r>
-        <w:rPr>
-          <w:sz w:val="20"/>
-          <w:szCs w:val="20"/>
-        </w:rPr>
-        <w:t xml:space="preserve"> nainstalována dobíjecí stanice. V případě použití dobíjecí stanice: </w:t>
-      </w:r>
-      <w:r>
-        <w:rPr>
-          <w:b/>
-          <w:bCs/>
-          <w:sz w:val="20"/>
-          <w:szCs w:val="20"/>
-        </w:rPr>
-        <w:t>JE</w:t>
-      </w:r>
-      <w:r>
-        <w:rPr>
-          <w:sz w:val="20"/>
-          <w:szCs w:val="20"/>
-        </w:rPr>
-        <w:t xml:space="preserve"> zapojena v měření FVE a chová se jako běžný spotřebič, může využívat energii z baterií / </w:t>
-      </w:r>
-      <w:r>
-        <w:rPr>
-          <w:b/>
-          <w:bCs/>
-          <w:sz w:val="20"/>
-          <w:szCs w:val="20"/>
-        </w:rPr>
-        <w:t>NENÍ</w:t>
-      </w:r>
-      <w:r>
-        <w:rPr>
-          <w:sz w:val="20"/>
-          <w:szCs w:val="20"/>
-        </w:rPr>
-        <w:t xml:space="preserve"> zapojena v měření a nemůže využívat energii z baterií.</w:t>
-      </w:r>
-    </w:p>
-    <w:p>
-      <w:pPr>
-        <w:pStyle w:val="Nadpis2"/>
-        <w:spacing w:before="102"/>
-      </w:pPr>
-      <w:r>
-        <w:t>Prohlášení pře</w:t>
-      </w:r>
-      <w:r>
-        <w:t>jímajícího</w:t>
-      </w:r>
-      <w:r>
-        <w:t>:</w:t>
+        <w:pStyle w:val="Bezmezer"/>
+      </w:pPr>
+      <w:r>
+        <w:rPr/>
+        <w:t xml:space="preserve">{#prejimajici}</w:t>
       </w:r>
     </w:p>
     <w:p>
@@ -879,143 +599,36 @@
         </w:numPr>
       </w:pPr>
       <w:r>
-        <w:t>Přejímající prohlašuje, že umístnění a rozložení panelů na střeše proběhlo po domluvě s techniky a odpovídá jeho požadavkům.</w:t>
+        <w:rPr/>
+        <w:t xml:space="preserve">{#casti}{#b}</w:t>
+      </w:r>
+      <w:r>
+        <w:rPr>
+          <w:b/>
+          <w:bCs/>
+        </w:rPr>
+        <w:t xml:space="preserve">{t}</w:t>
+      </w:r>
+      <w:r>
+        <w:rPr/>
+        <w:t xml:space="preserve">{/b}{^b}</w:t>
+      </w:r>
+      <w:r>
+        <w:rPr/>
+        <w:t xml:space="preserve">{t}</w:t>
+      </w:r>
+      <w:r>
+        <w:rPr/>
+        <w:t xml:space="preserve">{/b}{/casti}</w:t>
       </w:r>
     </w:p>
     <w:p>
       <w:pPr>
-        <w:pStyle w:val="Bezmezer1"/>
-        <w:numPr>
-          <w:ilvl w:val="0"/>
-          <w:numId w:val="22"/>
-        </w:numPr>
-        <w:rPr>
-          <w:sz w:val="20"/>
-          <w:szCs w:val="20"/>
-        </w:rPr>
-      </w:pPr>
-      <w:r>
-        <w:rPr>
-          <w:sz w:val="20"/>
-          <w:szCs w:val="20"/>
-        </w:rPr>
-        <w:t>Přejímající prohlašuje, že byl seznámen s funkcí zálohovaných okruhů, při normálním provozu i při výpadku dodávky el. energie, a to zejména s limitem přetížitelnosti jištění, a se zapojením jmenovaných spotřebičů souhlasí bez výhrad.</w:t>
-      </w:r>
-    </w:p>
-    <w:p>
-      <w:pPr>
-        <w:pStyle w:val="Bezmezer1"/>
-        <w:numPr>
-          <w:ilvl w:val="0"/>
-          <w:numId w:val="22"/>
-        </w:numPr>
-        <w:rPr>
-          <w:szCs w:val="20"/>
-        </w:rPr>
-      </w:pPr>
-      <w:r>
-        <w:rPr>
-          <w:sz w:val="20"/>
-          <w:szCs w:val="20"/>
-        </w:rPr>
-        <w:t>Přejímající byl srozuměn s tím, že nepřipojení solární elektrárny k lokální datové síti zákazníka není oprávněným důvodem k reklamaci funkce solární elektrárny.</w:t>
-      </w:r>
-    </w:p>
-    <w:p>
-      <w:pPr>
-        <w:pStyle w:val="Bezmezer1"/>
-        <w:numPr>
-          <w:ilvl w:val="0"/>
-          <w:numId w:val="22"/>
-        </w:numPr>
-        <w:rPr>
-          <w:sz w:val="20"/>
-          <w:szCs w:val="20"/>
-        </w:rPr>
-      </w:pPr>
-      <w:r>
-        <w:rPr>
-          <w:sz w:val="20"/>
-          <w:szCs w:val="20"/>
-        </w:rPr>
-        <w:t xml:space="preserve"> Přejímající dále prohlašuje, že byl seznámen s funkcí solární elektrárny a proškolen na obsluhu díla zejména – zapnutí / vypnutí.</w:t>
-      </w:r>
-    </w:p>
-    <w:p>
-      <w:pPr>
-        <w:pStyle w:val="Bezmezer1"/>
-        <w:numPr>
-          <w:ilvl w:val="0"/>
-          <w:numId w:val="22"/>
-        </w:numPr>
-        <w:rPr>
-          <w:sz w:val="20"/>
-          <w:szCs w:val="20"/>
-        </w:rPr>
-      </w:pPr>
-      <w:r>
-        <w:rPr>
-          <w:sz w:val="20"/>
-          <w:szCs w:val="20"/>
-        </w:rPr>
-        <w:t>Přejímající prohlašuje, že staveniště bylo řádně vyklizeno, odpady a nečistoty byly odstraněny a předáno ve stavu nebránícímu zahájit a dokončit přejímací řízení.</w:t>
-      </w:r>
-    </w:p>
-    <w:p>
-      <w:pPr>
-        <w:pStyle w:val="Bezmezer1"/>
-        <w:numPr>
-          <w:ilvl w:val="0"/>
-          <w:numId w:val="22"/>
-        </w:numPr>
-        <w:rPr>
-          <w:sz w:val="20"/>
-          <w:szCs w:val="20"/>
-        </w:rPr>
-      </w:pPr>
-      <w:r>
-        <w:rPr>
-          <w:sz w:val="20"/>
-          <w:szCs w:val="20"/>
-        </w:rPr>
-        <w:t xml:space="preserve">Přejímající prohlašuje, že byl řádně seznámen s povinností mít solární elektrárnu vypnutou až do doby, než mu technik distributora elektrické energie (PRE, ČEZ, EON) vymění elektroměr a vystaví protokol o připojení k distribuční soustavě. Tento protokol se zavazuje přejímající bezodkladně zaslat na e-mailovou adresu: info@jurenkaelektro.cz.  </w:t>
-      </w:r>
-    </w:p>
-    <w:p>
-      <w:pPr>
-        <w:pStyle w:val="Bezmezer1"/>
-        <w:numPr>
-          <w:ilvl w:val="0"/>
-          <w:numId w:val="22"/>
-        </w:numPr>
-        <w:rPr>
-          <w:sz w:val="20"/>
-          <w:szCs w:val="20"/>
-        </w:rPr>
-      </w:pPr>
-      <w:r>
-        <w:rPr>
-          <w:sz w:val="20"/>
-          <w:szCs w:val="20"/>
-        </w:rPr>
-        <w:t xml:space="preserve">Přejímající také prohlašuje, že byl poučen, že v případě poruchy systému je nutné kontaktovat servisní linku předávajícího na e-mailovou adresu </w:t>
-      </w:r>
-      <w:hyperlink r:id="rId11" w:history="1">
-        <w:r>
-          <w:rPr>
-            <w:rStyle w:val="Hypertextovodkaz"/>
-            <w:sz w:val="20"/>
-            <w:szCs w:val="20"/>
-          </w:rPr>
-          <w:t>info@jurenkaelektro.cz</w:t>
-        </w:r>
-      </w:hyperlink>
-      <w:r>
-        <w:rPr>
-          <w:sz w:val="20"/>
-          <w:szCs w:val="20"/>
-        </w:rPr>
-        <w:t xml:space="preserve">.  </w:t>
+        <w:pStyle w:val="Bezmezer"/>
+      </w:pPr>
+      <w:r>
+        <w:rPr/>
+        <w:t xml:space="preserve">{/prejimajici}</w:t>
       </w:r>
     </w:p>
     <w:p>

</xml_diff>